<commit_message>
Regenerate the web documentation DOCX and PDF
</commit_message>
<xml_diff>
--- a/docs/SmartPot_Web_Documentation.docx
+++ b/docs/SmartPot_Web_Documentation.docx
@@ -198,7 +198,7 @@
                 <w:sz w:val="21"/>
                 <w:szCs w:val="21"/>
               </w:rPr>
-              <w:t xml:space="preserve">PWA instalable: panel general, creación de cultivos reales o virtuales, cultivo en vivo ilustrado con cada actuador, asistente de IA, control, aprendizaje, alertas y Telegram, con su seguridad, configuración y pruebas.</w:t>
+              <w:t xml:space="preserve">PWA instalable: panel general, creación de cultivos reales o virtuales, ilustración de cada cultivo con su especie y sus actuadores, asistente de IA, control, aprendizaje, alertas y Telegram, con su seguridad, configuración y pruebas.</w:t>
             </w:r>
           </w:p>
         </w:tc>
@@ -788,7 +788,7 @@
                 <w:sz w:val="17"/>
                 <w:szCs w:val="17"/>
               </w:rPr>
-              <w:t xml:space="preserve">Pantallas, creación de cultivos, cultivo en vivo, sesión, caché, identidad visual, seguridad web, configuración y pruebas</w:t>
+              <w:t xml:space="preserve">Pantallas, creación de cultivos, ilustración del cultivo, sesión, caché, identidad visual, seguridad web, configuración y pruebas</w:t>
             </w:r>
           </w:p>
         </w:tc>
@@ -1113,7 +1113,7 @@
             <w:sz w:val="21"/>
             <w:szCs w:val="21"/>
           </w:rPr>
-          <w:t xml:space="preserve">4. Cultivo en vivo</w:t>
+          <w:t xml:space="preserve">4. Ilustración del cultivo</w:t>
         </w:r>
       </w:hyperlink>
     </w:p>
@@ -1670,7 +1670,7 @@
                 <w:sz w:val="17"/>
                 <w:szCs w:val="17"/>
               </w:rPr>
-              <w:t xml:space="preserve">Resumen, cultivo en vivo, asistente IA, control, historial, dispositivo (solo reales) y ajustes</w:t>
+              <w:t xml:space="preserve">La ilustración del cultivo sobre todas las secciones: resumen, asistente IA, control, historial, dispositivo (reales) o simulación (virtuales) y ajustes</w:t>
             </w:r>
           </w:p>
         </w:tc>
@@ -2151,7 +2151,7 @@
       <w:r>
         <w:drawing>
           <wp:inline distT="0" distB="0" distL="0" distR="0">
-            <wp:extent cx="4213171" cy="7112000"/>
+            <wp:extent cx="4146536" cy="7112000"/>
             <wp:docPr id="109" name="SmartPot_Web_01_Crop_Creation_Flow"/>
             <wp:cNvGraphicFramePr>
               <a:graphicFrameLocks noChangeAspect="1"/>
@@ -2172,7 +2172,7 @@
                   <pic:spPr>
                     <a:xfrm>
                       <a:off x="0" y="0"/>
-                      <a:ext cx="4213171" cy="7112000"/>
+                      <a:ext cx="4146536" cy="7112000"/>
                     </a:xfrm>
                     <a:prstGeom prst="rect">
                       <a:avLst/>
@@ -2622,7 +2622,7 @@
                 <w:sz w:val="17"/>
                 <w:szCs w:val="17"/>
               </w:rPr>
-              <w:t xml:space="preserve">Día y noche, clima real (buscador de lugares o ubicación del dispositivo) o manual; abre directo Cultivo en vivo</w:t>
+              <w:t xml:space="preserve">Día y noche, clima real (buscador de lugares o ubicación del dispositivo) o manual; abre el cultivo y su configuración queda en la pestaña Simulación</w:t>
             </w:r>
           </w:p>
         </w:tc>
@@ -2681,7 +2681,7 @@
           <w:sz w:val="34"/>
           <w:szCs w:val="34"/>
         </w:rPr>
-        <w:t xml:space="preserve">Cultivo en vivo</w:t>
+        <w:t xml:space="preserve">Ilustración del cultivo</w:t>
       </w:r>
       <w:bookmarkEnd w:id="110"/>
     </w:p>
@@ -2751,7 +2751,7 @@
           <w:sz w:val="16"/>
           <w:szCs w:val="16"/>
         </w:rPr>
-        <w:t xml:space="preserve">  ·  Cómo se dibuja el cultivo en vivo</w:t>
+        <w:t xml:space="preserve">  ·  Cómo se dibuja la ilustración del cultivo</w:t>
       </w:r>
     </w:p>
     <w:p>
@@ -3272,7 +3272,7 @@
                 <w:sz w:val="17"/>
                 <w:szCs w:val="17"/>
               </w:rPr>
-              <w:t xml:space="preserve">La especie con el color de su salud: verde sano, amarillento en riesgo, ocre crítico</w:t>
+              <w:t xml:space="preserve">La especie tal como es: lechuga en roseta, espinaca de hoja ancha, albahaca de hojas pareadas, tomate con tutor, flores y frutos rojos, fresa con flor blanca y frutos, pimentón rojo y amarillo; las hojas con el color de su salud: verde sano, amarillento en riesgo, ocre crítico</w:t>
             </w:r>
           </w:p>
         </w:tc>
@@ -3313,7 +3313,24 @@
           <w:sz w:val="20"/>
           <w:szCs w:val="20"/>
         </w:rPr>
-        <w:t xml:space="preserve"> (qué se ve y qué está encendido) y sus animaciones se detienen si la persona prefiere menos movimiento. Junto a ella, la lista de actuadores muestra el estado de cada uno con un botón para encenderlo por su tiempo típico o apagarlo. Si el cultivo no está conectado no se ilustra: se explica cómo conectarlo (reales) o se ofrece reanudar la simulación (virtuales). En los virtuales, debajo van los controles de la simulación: modo, lugar, medidores, frecuencia y pausa.</w:t>
+        <w:t xml:space="preserve"> (qué se ve y qué está encendido) y sus animaciones se detienen si la persona prefiere menos movimiento. Va encima de todas las secciones del detalle (</w:t>
+      </w:r>
+      <w:r>
+        <w:rPr>
+          <w:rFonts w:ascii="JetBrains Mono" w:hAnsi="JetBrains Mono" w:eastAsia="JetBrains Mono" w:cs="JetBrains Mono"/>
+          <w:color w:val="0A5A3C"/>
+          <w:sz w:val="18"/>
+          <w:szCs w:val="18"/>
+        </w:rPr>
+        <w:t xml:space="preserve">CropHero</w:t>
+      </w:r>
+      <w:r>
+        <w:rPr>
+          <w:color w:val="17261F"/>
+          <w:sz w:val="20"/>
+          <w:szCs w:val="20"/>
+        </w:rPr>
+        <w:t xml:space="preserve">). Junto a ella, cada actuador aparece como una etiqueta con su estado; no hay botones: las órdenes se dan en Control. Si el cultivo no está conectado no se ilustra: se explica cómo conectarlo (reales) o se lleva a la pestaña Simulación para reanudarla (virtuales). La configuración de la simulación (modo, lugar, medidores, frecuencia y pausa) vive en esa pestaña, que solo aparece en los cultivos virtuales.</w:t>
       </w:r>
     </w:p>
     <w:p>
@@ -4674,7 +4691,7 @@
           <w:sz w:val="20"/>
           <w:szCs w:val="20"/>
         </w:rPr>
-        <w:t xml:space="preserve">. Las 52 pruebas de Vitest y Testing Library cubren el cliente HTTP y sus errores, la sesión, las validaciones, el ingreso, los componentes del cultivo, el asistente con pronóstico y lo aprendido, la comparación de modelos, Telegram, el panel general, el cultivo en vivo (formas, actuadores, clima y conexión), la creación real o virtual, la guía de conexión y los requisitos de SEO y PWA.</w:t>
+        <w:t xml:space="preserve">. Las 54 pruebas de Vitest y Testing Library cubren el cliente HTTP y sus errores, la sesión, las validaciones, el ingreso, los componentes del cultivo, el asistente con pronóstico y lo aprendido, la comparación de modelos, Telegram, el panel general, la ilustración del cultivo (formas, especies, actuadores, clima y conexión), la creación real o virtual, la guía de conexión y los requisitos de SEO y PWA.</w:t>
       </w:r>
     </w:p>
     <w:p>

</xml_diff>